<commit_message>
docs: add plain-language macOS install guide and manual steps
</commit_message>
<xml_diff>
--- a/docs/manual/ZHIRAI-AI-Lead-Generation-CRM-1.1.0-1025-Desktop-Manual-zh-CN.docx
+++ b/docs/manual/ZHIRAI-AI-Lead-Generation-CRM-1.1.0-1025-Desktop-Manual-zh-CN.docx
@@ -348,7 +348,7 @@
         <w:rPr>
           <w:rFonts w:ascii="Microsoft YaHei" w:hAnsi="Microsoft YaHei" w:eastAsia="Microsoft YaHei"/>
         </w:rPr>
-        <w:t>macOS：仅 Apple Silicon（M1/M2/M3/M4）。执行 tar -xzf ZHIRAI-1.1.0-1025-macOS-arm64.tar.gz，打开 ZHIRAI-Base.app（Finder 显示名称为 ZHIRAI）。</w:t>
+        <w:t>macOS：仅 Apple Silicon（M1/M2/M3/M4），要求 macOS 13 或以上。下载 .tar.gz 压缩包，在 Finder 里双击解压，再双击 ZHIRAI-Base.app。它不是 DMG/ISO 镜像，不需要终端命令，也不需要安装 Node.js。</w:t>
       </w:r>
     </w:p>
     <w:p>
@@ -388,7 +388,7 @@
         <w:rPr>
           <w:rFonts w:ascii="Microsoft YaHei" w:hAnsi="Microsoft YaHei" w:eastAsia="Microsoft YaHei"/>
         </w:rPr>
-        <w:t>4. 关闭窗口即退出；数据在 %APPDATA%\zhirai-europe-b2b-outreach\data。</w:t>
+        <w:t>4. 关闭窗口即退出；数据在 %APPDATA%\ai-lead-generation-crm\data。</w:t>
       </w:r>
     </w:p>
     <w:p>
@@ -436,7 +436,7 @@
         <w:rPr>
           <w:rFonts w:ascii="Microsoft YaHei" w:hAnsi="Microsoft YaHei" w:eastAsia="Microsoft YaHei"/>
         </w:rPr>
-        <w:t>0.4 macOS 启动</w:t>
+        <w:t>0.4 macOS 版怎么打开（白话步骤）</w:t>
       </w:r>
     </w:p>
     <w:p>
@@ -444,7 +444,7 @@
         <w:rPr>
           <w:rFonts w:ascii="Microsoft YaHei" w:hAnsi="Microsoft YaHei" w:eastAsia="Microsoft YaHei"/>
         </w:rPr>
-        <w:t>1. 在 macOS 终端执行：tar -xzf ZHIRAI-1.1.0-1025-macOS-arm64.tar.gz。</w:t>
+        <w:t>1. 下载 ZHIRAI-1.1.0-1025-macOS-arm64.tar.gz。</w:t>
       </w:r>
     </w:p>
     <w:p>
@@ -452,7 +452,7 @@
         <w:rPr>
           <w:rFonts w:ascii="Microsoft YaHei" w:hAnsi="Microsoft YaHei" w:eastAsia="Microsoft YaHei"/>
         </w:rPr>
-        <w:t>2. 打开 ZHIRAI-Base.app；如果 Gatekeeper 拦截，右键 → 打开。</w:t>
+        <w:t>2. 在 Finder 里双击这个 .tar.gz 文件，系统会解压出一个文件夹；这不是磁盘镜像，不需要挂载。</w:t>
       </w:r>
     </w:p>
     <w:p>
@@ -460,7 +460,7 @@
         <w:rPr>
           <w:rFonts w:ascii="Microsoft YaHei" w:hAnsi="Microsoft YaHei" w:eastAsia="Microsoft YaHei"/>
         </w:rPr>
-        <w:t>3. 首次打开同样进入“初始化你的工作台”。</w:t>
+        <w:t>3. 打开解压后的文件夹，双击 ZHIRAI-Base.app。Finder 可能显示名称为“ZHIRAI AI Lead Generation CRM”。</w:t>
       </w:r>
     </w:p>
     <w:p>
@@ -468,7 +468,31 @@
         <w:rPr>
           <w:rFonts w:ascii="Microsoft YaHei" w:hAnsi="Microsoft YaHei" w:eastAsia="Microsoft YaHei"/>
         </w:rPr>
-        <w:t>4. 数据在 ~/Library/Application Support/zhirai-europe-b2b-outreach/data。</w:t>
+        <w:t>4. 第一次打开如果被 macOS 拦截：右键点击应用 → 选择“打开” → 弹窗里再点“打开”。仍不行时，去“系统设置 → 隐私与安全性”点“仍要打开”。</w:t>
+      </w:r>
+    </w:p>
+    <w:p>
+      <w:pPr/>
+      <w:r>
+        <w:t>5. 等几秒，程序会启动并自动打开浏览器；如果没有自动打开，手动访问 http://127.0.0.1:4173。</w:t>
+      </w:r>
+    </w:p>
+    <w:p>
+      <w:pPr/>
+      <w:r>
+        <w:t>6. 首次进入会显示“初始化你的工作台”，按页面创建管理员账号。</w:t>
+      </w:r>
+    </w:p>
+    <w:p>
+      <w:pPr/>
+      <w:r>
+        <w:t>7. 退出：点左上角菜单“ZHIRAI AI Lead Generation CRM → 退出”，或按 Command+Q。</w:t>
+      </w:r>
+    </w:p>
+    <w:p>
+      <w:pPr/>
+      <w:r>
+        <w:t>8. 数据默认在：~/Library/Application Support/ai-lead-generation-crm/data。备份前先退出程序。</w:t>
       </w:r>
     </w:p>
     <w:p>
@@ -556,7 +580,7 @@
         <w:rPr>
           <w:rFonts w:ascii="Microsoft YaHei" w:hAnsi="Microsoft YaHei" w:eastAsia="Microsoft YaHei"/>
         </w:rPr>
-        <w:t>macOS 提示无法打开：右键应用选择“打开”；仍失败时在“系统设置 → 隐私与安全性”允许。</w:t>
+        <w:t>macOS 提示“无法打开，因为无法验证开发者”：这是未签名/未公证版本的系统提示，不是病毒。右键应用 →“打开”→ 再点“打开”；仍不行时到“系统设置 → 隐私与安全性”允许。只从官方发布来源下载。</w:t>
       </w:r>
     </w:p>
     <w:p>
@@ -3350,7 +3374,7 @@
         <w:rPr>
           <w:rFonts w:ascii="Microsoft YaHei" w:hAnsi="Microsoft YaHei" w:eastAsia="Microsoft YaHei"/>
         </w:rPr>
-        <w:t>「备份与系统」包含运行状态、数据库备份、系统日志、许可证与依赖。桌面版数据目录不是 server/data：Windows 完整版在 %APPDATA%\zhirai-europe-b2b-outreach\data，Windows 基础版在 %LOCALAPPDATA%\ZHIRAI\1.1.0-1025\data，macOS 在 ~/Library/Application Support/zhirai-europe-b2b-outreach/data。备份前先关闭程序。</w:t>
+        <w:t>“备份与系统”包含运行状态、数据库备份、系统日志、许可证与依赖。桌面版数据目录不是 server/data：Windows 完整版在 %APPDATA%\ai-lead-generation-crm\data，Windows 基础版在 %LOCALAPPDATA%\ZHIRAI\1.1.0-1025\data，macOS 在 ~/Library/Application Support/ai-lead-generation-crm/data。备份前先关闭程序。</w:t>
       </w:r>
     </w:p>
     <w:p>

</xml_diff>